<commit_message>
A Gmail already connected elsewhere says so, instead of "try again"
0103 made a mailbox readable by one account and said the app should catch
the refusal. It never did: a second account granting the same Gmail passed
Google's consent, hit mailbox_grants_one_per_mailbox, bounced store_failed,
and saw "Chưa kết nối được · Thử lại", which fails the same way forever.
Real case: kaoheen@.

- mailbox-connect callback maps the index name to reason=mailbox_taken
  (no migration). DEPLOYED as mailbox-connect v9; redeploy carries only
  this change (live v8 matched 921d68c; only gmail.mjs imported, unchanged).
- client: _atxReturnState -> 'taken', dedicated bilingual sheet with the
  way to move the mailbox; never names the holding account.
- tools/autotxn-return.test.js covers the reason= branch (harness was
  missing _ATX_DENIED, so reason cases had silently read as null).

Co-Authored-By: Claude Opus 5 (1M context) <noreply@anthropic.com>
</commit_message>
<xml_diff>
--- a/docs/specs/effortless-transaction-logging-spec.docx
+++ b/docs/specs/effortless-transaction-logging-spec.docx
@@ -13082,26 +13082,26 @@
       </w:r>
       <w:r>
         <w:rPr/>
-        <w:t xml:space="preserve">). It reads real mailboxes and parses real Vietnamese bank mail correctly. </w:t>
+        <w:t xml:space="preserve">). It reads real mailboxes and parses real Vietnamese bank mail correctly. The implemented bridge now hands valid readings to </w:t>
+      </w:r>
+      <w:r>
+        <w:rPr>
+          <w:rFonts w:ascii="Consolas" w:hAnsi="Consolas"/>
+          <w:b w:val="0"/>
+          <w:color w:val="2A4A3A"/>
+          <w:sz w:val="20"/>
+        </w:rPr>
+        <w:t>POST /mailbox-sync/ingest</w:t>
+      </w:r>
+      <w:r>
+        <w:rPr/>
+        <w:t xml:space="preserve">; it remains </w:t>
       </w:r>
       <w:r>
         <w:rPr>
           <w:b/>
         </w:rPr>
-        <w:t>What it does not do is persist</w:t>
-      </w:r>
-      <w:r>
-        <w:rPr/>
-        <w:t xml:space="preserve">: the parser ends at </w:t>
-      </w:r>
-      <w:r>
-        <w:rPr>
-          <w:rFonts w:ascii="Consolas" w:hAnsi="Consolas"/>
-          <w:b w:val="0"/>
-          <w:color w:val="2A4A3A"/>
-          <w:sz w:val="20"/>
-        </w:rPr>
-        <w:t># TODO: persist</w:t>
+        <w:t>not deployed</w:t>
       </w:r>
       <w:r>
         <w:rPr/>
@@ -13253,7 +13253,41 @@
           <w:color w:val="2A4A3A"/>
           <w:sz w:val="18"/>
         </w:rPr>
-        <w:t xml:space="preserve">   transaction-parser            strip html → amount/direction/balance</w:t>
+        <w:t xml:space="preserve">   transaction-parser            normalize → detect → stored spec / label table / Gemini</w:t>
+      </w:r>
+    </w:p>
+    <w:p>
+      <w:pPr>
+        <w:spacing w:before="0" w:after="0" w:line="240" w:lineRule="auto"/>
+        <w:ind w:left="283"/>
+        <w:pBdr>
+          <w:left w:val="single" w:sz="12" w:space="10" w:color="C7D2CA"/>
+        </w:pBdr>
+      </w:pPr>
+      <w:r>
+        <w:rPr>
+          <w:rFonts w:ascii="Consolas" w:hAnsi="Consolas"/>
+          <w:color w:val="2A4A3A"/>
+          <w:sz w:val="18"/>
+        </w:rPr>
+        <w:t xml:space="preserve">                                 (Gemini `gemini-3.5-flash` for unknown layouts)</w:t>
+      </w:r>
+    </w:p>
+    <w:p>
+      <w:pPr>
+        <w:spacing w:before="0" w:after="0" w:line="240" w:lineRule="auto"/>
+        <w:ind w:left="283"/>
+        <w:pBdr>
+          <w:left w:val="single" w:sz="12" w:space="10" w:color="C7D2CA"/>
+        </w:pBdr>
+      </w:pPr>
+      <w:r>
+        <w:rPr>
+          <w:rFonts w:ascii="Consolas" w:hAnsi="Consolas"/>
+          <w:color w:val="2A4A3A"/>
+          <w:sz w:val="18"/>
+        </w:rPr>
+        <w:t xml:space="preserve">                     ↓ HTTPS + x-sync-secret (when configured)</w:t>
       </w:r>
     </w:p>
     <w:p>
@@ -13270,7 +13304,7 @@
           <w:color w:val="2A4A3A"/>
           <w:sz w:val="18"/>
         </w:rPr>
-        <w:t xml:space="preserve">                                 (Gemini `gemini-3.5-flash` for unknown layouts)</w:t>
+        <w:t xml:space="preserve">   /mailbox-sync/ingest          validate → tidy → dedup → seal → insert</w:t>
       </w:r>
     </w:p>
     <w:p>
@@ -13664,65 +13698,14 @@
               <w:rPr>
                 <w:sz w:val="19"/>
               </w:rPr>
-              <w:t xml:space="preserve">Built; 445 of their tests green; </w:t>
+              <w:t xml:space="preserve">Implemented locally; parse-only when both settings are absent, retry on transport/auth/server faults, ack all five HTTP-200 decisions. </w:t>
             </w:r>
             <w:r>
               <w:rPr>
                 <w:b/>
                 <w:sz w:val="19"/>
               </w:rPr>
-              <w:t>unmerged</w:t>
-            </w:r>
-            <w:r>
-              <w:rPr>
-                <w:sz w:val="19"/>
-              </w:rPr>
-              <w:t xml:space="preserve"> on </w:t>
-            </w:r>
-            <w:r>
-              <w:rPr>
-                <w:rFonts w:ascii="Consolas" w:hAnsi="Consolas"/>
-                <w:b w:val="0"/>
-                <w:color w:val="2A4A3A"/>
-                <w:sz w:val="17"/>
-              </w:rPr>
-              <w:t>claude/email-reading-integration-ddwqd2</w:t>
-            </w:r>
-            <w:r>
-              <w:rPr>
-                <w:sz w:val="19"/>
-              </w:rPr>
-              <w:t xml:space="preserve"> pending backend review. Contract pinned by </w:t>
-            </w:r>
-            <w:r>
-              <w:rPr>
-                <w:rFonts w:ascii="Consolas" w:hAnsi="Consolas"/>
-                <w:b w:val="0"/>
-                <w:color w:val="2A4A3A"/>
-                <w:sz w:val="17"/>
-              </w:rPr>
-              <w:t>direct-persist-contract.test.js</w:t>
-            </w:r>
-            <w:r>
-              <w:rPr>
-                <w:sz w:val="19"/>
-              </w:rPr>
-              <w:t xml:space="preserve"> (real Python </w:t>
-            </w:r>
-            <w:r>
-              <w:rPr>
-                <w:rFonts w:ascii="Consolas" w:hAnsi="Consolas"/>
-                <w:b w:val="0"/>
-                <w:color w:val="2A4A3A"/>
-                <w:sz w:val="17"/>
-              </w:rPr>
-              <w:t>build_payload</w:t>
-            </w:r>
-            <w:r>
-              <w:rPr>
-                <w:sz w:val="19"/>
-              </w:rPr>
-              <w:t xml:space="preserve"> → real sealer → real client opener)</w:t>
+              <w:t>Not deployed</w:t>
             </w:r>
           </w:p>
         </w:tc>
@@ -13918,24 +13901,11 @@
         <w:rPr>
           <w:b/>
         </w:rPr>
-        <w:t xml:space="preserve"> contract — the seam the bridge will cross.</w:t>
-      </w:r>
-      <w:r>
-        <w:rPr/>
-        <w:t xml:space="preserve"> When </w:t>
-      </w:r>
-      <w:r>
-        <w:rPr>
-          <w:rFonts w:ascii="Consolas" w:hAnsi="Consolas"/>
-          <w:b w:val="0"/>
-          <w:color w:val="2A4A3A"/>
-          <w:sz w:val="20"/>
-        </w:rPr>
-        <w:t>persist.py</w:t>
-      </w:r>
-      <w:r>
-        <w:rPr/>
-        <w:t xml:space="preserve"> merges, transport C stops at parsing and hands over; transport B's worker does the half C deliberately does not. The contract (</w:t>
+        <w:t xml:space="preserve"> contract — the seam the bridge crosses when configured.</w:t>
+      </w:r>
+      <w:r>
+        <w:rPr/>
+        <w:t xml:space="preserve"> Transport C stops at validated parsing and hands over; transport B's worker does the half C deliberately does not. The contract lives in </w:t>
       </w:r>
       <w:r>
         <w:rPr>
@@ -13948,33 +13918,7 @@
       </w:r>
       <w:r>
         <w:rPr/>
-        <w:t xml:space="preserve">), pinned by </w:t>
-      </w:r>
-      <w:r>
-        <w:rPr>
-          <w:rFonts w:ascii="Consolas" w:hAnsi="Consolas"/>
-          <w:b w:val="0"/>
-          <w:color w:val="2A4A3A"/>
-          <w:sz w:val="20"/>
-        </w:rPr>
-        <w:t>direct-persist-contract.test.js</w:t>
-      </w:r>
-      <w:r>
-        <w:rPr/>
-        <w:t xml:space="preserve"> (real Python </w:t>
-      </w:r>
-      <w:r>
-        <w:rPr>
-          <w:rFonts w:ascii="Consolas" w:hAnsi="Consolas"/>
-          <w:b w:val="0"/>
-          <w:color w:val="2A4A3A"/>
-          <w:sz w:val="20"/>
-        </w:rPr>
-        <w:t>build_payload</w:t>
-      </w:r>
-      <w:r>
-        <w:rPr/>
-        <w:t xml:space="preserve"> → real sealer → real client opener):</w:t>
+        <w:t>:</w:t>
       </w:r>
     </w:p>
     <w:p>
@@ -14128,7 +14072,7 @@
       </w:r>
       <w:r>
         <w:rPr/>
-        <w:t xml:space="preserve">), and optionally currency (default VND), merchant/counterparty, description/memo, balance, type_code, channel, account_tail, reference, category, occurred_at, sender_auth. Field-name translation lives in </w:t>
+        <w:t xml:space="preserve">), and optionally currency (default VND), merchant/counterparty, description/memo, balance, FX pair, transaction type, status, account kind, flow, type_code, channel, account_tail, reference, category, occurred_at, sender_auth. Field-name translation lives in </w:t>
       </w:r>
       <w:r>
         <w:rPr>
@@ -14279,7 +14223,7 @@
       </w:r>
       <w:r>
         <w:rPr/>
-        <w:t xml:space="preserve"> (malformed / no_message_id / no_email / no_amount / bad_direction), </w:t>
+        <w:t xml:space="preserve"> (malformed / no_message_id / no_email / no_amount / bad_direction / incomplete_status), </w:t>
       </w:r>
       <w:r>
         <w:rPr>
@@ -28452,7 +28396,7 @@
       </w:r>
       <w:r>
         <w:rPr/>
-        <w:t xml:space="preserve"> per function plus the parser suites (445 green on the bridge branch).</w:t>
+        <w:t xml:space="preserve"> per function plus the parser suites (453 green locally); the real Edge sealing/opening regressions remain green.</w:t>
       </w:r>
     </w:p>
     <w:p>
@@ -28963,7 +28907,46 @@
       </w:r>
       <w:r>
         <w:rPr/>
-        <w:t xml:space="preserve"> Most households split by account, not merchant — "anything on the …4412 card is mine" is one rule where merchant rules would be dozens. Staged on every row already.</w:t>
+        <w:t xml:space="preserve"> Most households split by account, not merchant — "anything on the …4412 card is mine" is one rule where merchant rules would be dozens. Staged on every row already. First real use shipped 2026-09-07: a card repayment now matches its </w:t>
+      </w:r>
+      <w:r>
+        <w:rPr>
+          <w:rFonts w:ascii="Consolas" w:hAnsi="Consolas"/>
+          <w:b w:val="0"/>
+          <w:color w:val="2A4A3A"/>
+          <w:sz w:val="20"/>
+        </w:rPr>
+        <w:t>card_masked</w:t>
+      </w:r>
+      <w:r>
+        <w:rPr/>
+        <w:t>/</w:t>
+      </w:r>
+      <w:r>
+        <w:rPr>
+          <w:rFonts w:ascii="Consolas" w:hAnsi="Consolas"/>
+          <w:b w:val="0"/>
+          <w:color w:val="2A4A3A"/>
+          <w:sz w:val="20"/>
+        </w:rPr>
+        <w:t>account_masked</w:t>
+      </w:r>
+      <w:r>
+        <w:rPr/>
+        <w:t xml:space="preserve"> tail to the owned card and pre-selects it (</w:t>
+      </w:r>
+      <w:r>
+        <w:rPr>
+          <w:rFonts w:ascii="Consolas" w:hAnsi="Consolas"/>
+          <w:b w:val="0"/>
+          <w:color w:val="2A4A3A"/>
+          <w:sz w:val="20"/>
+        </w:rPr>
+        <w:t>card-repayment-routing-spec.md</w:t>
+      </w:r>
+      <w:r>
+        <w:rPr/>
+        <w:t>) — the same tail-matching a per-account routing rule would extend.</w:t>
       </w:r>
     </w:p>
     <w:p>
@@ -30238,7 +30221,7 @@
           <w:b/>
           <w:sz w:val="23"/>
         </w:rPr>
-        <w:t>2026-09-05 — mailbox-connect + mailbox-sync + client (DEPLOYED 2026-09-05) — the first minute after connect stops being silent</w:t>
+        <w:t>2026-09-15 — mailbox-connect + client — a Gmail already connected elsewhere says so</w:t>
       </w:r>
     </w:p>
     <w:p>
@@ -30253,7 +30236,7 @@
       </w:r>
       <w:r>
         <w:rPr/>
-        <w:t xml:space="preserve"> connecting Gmail now shows results while you watch. The first read starts within seconds of tapping Allow instead of waiting up to a minute for the cron lane, and the "Đã kết nối" screen is live: it counts the transactions as they land ("Tìm được 12 khoản…"), turns its button into "Xem 12 khoản", and keeps the badge in step — before, the screen was static, the badge only moved on app-open or refocus, and a person's first minute with the feature was an empty screen they read as "it didn't work". Both OAuth screens (success and status) now also offer to turn notifications on; that offer used to exist only on the forwarding screen and after a first hand-review, so an OAuth user had no push subscription and every "something is waiting" push landed nowhere.</w:t>
+        <w:t xml:space="preserve"> connecting a Gmail that another Earthy account already reads used to end on "Chưa kết nối được · Thử lại", and retrying could never work. It now says the mailbox is connected to another account and how to move it (stop reading there, reconnect here).</w:t>
       </w:r>
     </w:p>
     <w:p>
@@ -30268,345 +30251,72 @@
       </w:r>
       <w:r>
         <w:rPr/>
-        <w:t xml:space="preserve"> </w:t>
-      </w:r>
-      <w:r>
-        <w:rPr>
-          <w:rFonts w:ascii="Consolas" w:hAnsi="Consolas"/>
-          <w:b w:val="0"/>
-          <w:color w:val="2A4A3A"/>
-          <w:sz w:val="20"/>
-        </w:rPr>
-        <w:t>mailbox-connect</w:t>
-      </w:r>
-      <w:r>
-        <w:rPr/>
-        <w:t xml:space="preserve"> </w:t>
-      </w:r>
-      <w:r>
-        <w:rPr>
-          <w:rFonts w:ascii="Consolas" w:hAnsi="Consolas"/>
-          <w:b w:val="0"/>
-          <w:color w:val="2A4A3A"/>
-          <w:sz w:val="20"/>
-        </w:rPr>
-        <w:t>/callback</w:t>
-      </w:r>
-      <w:r>
-        <w:rPr/>
-        <w:t xml:space="preserve"> fires a fire-and-forget </w:t>
-      </w:r>
-      <w:r>
-        <w:rPr>
-          <w:rFonts w:ascii="Consolas" w:hAnsi="Consolas"/>
-          <w:b w:val="0"/>
-          <w:color w:val="2A4A3A"/>
-          <w:sz w:val="20"/>
-        </w:rPr>
-        <w:t>POST /mailbox-sync</w:t>
-      </w:r>
-      <w:r>
-        <w:rPr/>
-        <w:t xml:space="preserve"> </w:t>
-      </w:r>
-      <w:r>
-        <w:rPr>
-          <w:rFonts w:ascii="Consolas" w:hAnsi="Consolas"/>
-          <w:b w:val="0"/>
-          <w:color w:val="2A4A3A"/>
-          <w:sz w:val="20"/>
-        </w:rPr>
-        <w:t>{grant: &lt;id&gt;}</w:t>
-      </w:r>
-      <w:r>
-        <w:rPr/>
-        <w:t xml:space="preserve"> (shared secret, </w:t>
-      </w:r>
-      <w:r>
-        <w:rPr>
-          <w:rFonts w:ascii="Consolas" w:hAnsi="Consolas"/>
-          <w:b w:val="0"/>
-          <w:color w:val="2A4A3A"/>
-          <w:sz w:val="20"/>
-        </w:rPr>
-        <w:t>EdgeRuntime.waitUntil</w:t>
-      </w:r>
-      <w:r>
-        <w:rPr/>
-        <w:t>, before watch registration; best effort), and the watch registration itself moved off the redirect path (</w:t>
-      </w:r>
-      <w:r>
-        <w:rPr>
-          <w:rFonts w:ascii="Consolas" w:hAnsi="Consolas"/>
-          <w:b w:val="0"/>
-          <w:color w:val="2A4A3A"/>
-          <w:sz w:val="20"/>
-        </w:rPr>
-        <w:t>registerWatchBestEffort</w:t>
-      </w:r>
-      <w:r>
-        <w:rPr/>
-        <w:t xml:space="preserve">, same </w:t>
-      </w:r>
-      <w:r>
-        <w:rPr>
-          <w:rFonts w:ascii="Consolas" w:hAnsi="Consolas"/>
-          <w:b w:val="0"/>
-          <w:color w:val="2A4A3A"/>
-          <w:sz w:val="20"/>
-        </w:rPr>
-        <w:t>waitUntil</w:t>
-      </w:r>
-      <w:r>
-        <w:rPr/>
-        <w:t xml:space="preserve">; a lost registration is due-on-null for the renewal sweep) — the redirect returns ~0.5–1s sooner. </w:t>
-      </w:r>
-      <w:r>
-        <w:rPr>
-          <w:rFonts w:ascii="Consolas" w:hAnsi="Consolas"/>
-          <w:b w:val="0"/>
-          <w:color w:val="2A4A3A"/>
-          <w:sz w:val="20"/>
-        </w:rPr>
-        <w:t>mailbox-sync</w:t>
-      </w:r>
-      <w:r>
-        <w:rPr/>
-        <w:t xml:space="preserve"> routes the </w:t>
-      </w:r>
-      <w:r>
-        <w:rPr>
-          <w:rFonts w:ascii="Consolas" w:hAnsi="Consolas"/>
-          <w:b w:val="0"/>
-          <w:color w:val="2A4A3A"/>
-          <w:sz w:val="20"/>
-        </w:rPr>
-        <w:t>{grant}</w:t>
-      </w:r>
-      <w:r>
-        <w:rPr/>
-        <w:t xml:space="preserve"> body to new </w:t>
-      </w:r>
-      <w:r>
-        <w:rPr>
-          <w:rFonts w:ascii="Consolas" w:hAnsi="Consolas"/>
-          <w:b w:val="0"/>
-          <w:color w:val="2A4A3A"/>
-          <w:sz w:val="20"/>
-        </w:rPr>
-        <w:t>worker.runOne(grantId, ctx)</w:t>
-      </w:r>
-      <w:r>
-        <w:rPr/>
-        <w:t xml:space="preserve"> — the same lane body </w:t>
-      </w:r>
-      <w:r>
-        <w:rPr>
-          <w:rFonts w:ascii="Consolas" w:hAnsi="Consolas"/>
-          <w:b w:val="0"/>
-          <w:color w:val="2A4A3A"/>
-          <w:sz w:val="20"/>
-        </w:rPr>
-        <w:t>runAll</w:t>
-      </w:r>
-      <w:r>
-        <w:rPr/>
-        <w:t xml:space="preserve"> runs, scoped to one grant via new </w:t>
-      </w:r>
-      <w:r>
-        <w:rPr>
-          <w:rFonts w:ascii="Consolas" w:hAnsi="Consolas"/>
-          <w:b w:val="0"/>
-          <w:color w:val="2A4A3A"/>
-          <w:sz w:val="20"/>
-        </w:rPr>
-        <w:t>db.grantById</w:t>
-      </w:r>
-      <w:r>
-        <w:rPr/>
-        <w:t xml:space="preserve"> (same columns and </w:t>
-      </w:r>
-      <w:r>
-        <w:rPr>
-          <w:rFonts w:ascii="Consolas" w:hAnsi="Consolas"/>
-          <w:b w:val="0"/>
-          <w:color w:val="2A4A3A"/>
-          <w:sz w:val="20"/>
-        </w:rPr>
-        <w:t>needs_reauth</w:t>
-      </w:r>
-      <w:r>
-        <w:rPr/>
-        <w:t xml:space="preserve"> filter as </w:t>
-      </w:r>
-      <w:r>
-        <w:rPr>
-          <w:rFonts w:ascii="Consolas" w:hAnsi="Consolas"/>
-          <w:b w:val="0"/>
-          <w:color w:val="2A4A3A"/>
-          <w:sz w:val="20"/>
-        </w:rPr>
-        <w:t>dueGrants</w:t>
-      </w:r>
-      <w:r>
-        <w:rPr/>
-        <w:t xml:space="preserve">). Purely additive: </w:t>
-      </w:r>
-      <w:r>
-        <w:rPr>
-          <w:rFonts w:ascii="Consolas" w:hAnsi="Consolas"/>
-          <w:b w:val="0"/>
-          <w:color w:val="2A4A3A"/>
-          <w:sz w:val="20"/>
-        </w:rPr>
-        <w:t>runAll</w:t>
-      </w:r>
-      <w:r>
-        <w:rPr/>
-        <w:t>/</w:t>
-      </w:r>
-      <w:r>
-        <w:rPr>
-          <w:rFonts w:ascii="Consolas" w:hAnsi="Consolas"/>
-          <w:b w:val="0"/>
-          <w:color w:val="2A4A3A"/>
-          <w:sz w:val="20"/>
-        </w:rPr>
-        <w:t>runGrant</w:t>
-      </w:r>
-      <w:r>
-        <w:rPr/>
-        <w:t xml:space="preserve">/notify logic untouched; overlap with a cron run is the sanctioned 0097 shape. Client: </w:t>
-      </w:r>
-      <w:r>
-        <w:rPr>
-          <w:rFonts w:ascii="Consolas" w:hAnsi="Consolas"/>
-          <w:b w:val="0"/>
-          <w:color w:val="2A4A3A"/>
-          <w:sz w:val="20"/>
-        </w:rPr>
-        <w:t>74-autotxn-ui.js</w:t>
-      </w:r>
-      <w:r>
-        <w:rPr/>
-        <w:t xml:space="preserve"> gains </w:t>
-      </w:r>
-      <w:r>
-        <w:rPr>
-          <w:rFonts w:ascii="Consolas" w:hAnsi="Consolas"/>
-          <w:b w:val="0"/>
-          <w:color w:val="2A4A3A"/>
-          <w:sz w:val="20"/>
-        </w:rPr>
-        <w:t>_atxLiveWatch</w:t>
-      </w:r>
-      <w:r>
-        <w:rPr/>
-        <w:t xml:space="preserve"> — head-only pending count, eager 1.5s cadence until the first find (max 20s) then 4s, and closing the sheet DEMOTES it to badge-only polling (badge keeps moving, dead sheet DOM untouched) rather than stopping; the 3-minute window ends with one reconciling </w:t>
-      </w:r>
-      <w:r>
-        <w:rPr>
-          <w:rFonts w:ascii="Consolas" w:hAnsi="Consolas"/>
-          <w:b w:val="0"/>
-          <w:color w:val="2A4A3A"/>
-          <w:sz w:val="20"/>
-        </w:rPr>
-        <w:t>fhRefreshStagedCount</w:t>
-      </w:r>
-      <w:r>
-        <w:rPr/>
-        <w:t xml:space="preserve"> — and </w:t>
-      </w:r>
-      <w:r>
-        <w:rPr>
-          <w:rFonts w:ascii="Consolas" w:hAnsi="Consolas"/>
-          <w:b w:val="0"/>
-          <w:color w:val="2A4A3A"/>
-          <w:sz w:val="20"/>
-        </w:rPr>
-        <w:t>_atxPushRowSafe</w:t>
-      </w:r>
-      <w:r>
-        <w:rPr/>
-        <w:t xml:space="preserve"> (reuses 71's </w:t>
-      </w:r>
-      <w:r>
-        <w:rPr>
-          <w:rFonts w:ascii="Consolas" w:hAnsi="Consolas"/>
-          <w:b w:val="0"/>
-          <w:color w:val="2A4A3A"/>
-          <w:sz w:val="20"/>
-        </w:rPr>
-        <w:t>_mbxPushRow</w:t>
-      </w:r>
-      <w:r>
-        <w:rPr/>
-        <w:t xml:space="preserve">, resolved pre-render); </w:t>
-      </w:r>
-      <w:r>
-        <w:rPr>
-          <w:rFonts w:ascii="Consolas" w:hAnsi="Consolas"/>
-          <w:b w:val="0"/>
-          <w:color w:val="2A4A3A"/>
-          <w:sz w:val="20"/>
-        </w:rPr>
-        <w:t>fhAutoTxnDone</w:t>
-      </w:r>
-      <w:r>
-        <w:rPr/>
-        <w:t xml:space="preserve"> and </w:t>
-      </w:r>
-      <w:r>
-        <w:rPr>
-          <w:rFonts w:ascii="Consolas" w:hAnsi="Consolas"/>
-          <w:b w:val="0"/>
-          <w:color w:val="2A4A3A"/>
-          <w:sz w:val="20"/>
-        </w:rPr>
-        <w:t>fhAutoTxnStatus</w:t>
-      </w:r>
-      <w:r>
-        <w:rPr/>
-        <w:t xml:space="preserve"> are async + seq-guarded. Tests: </w:t>
-      </w:r>
-      <w:r>
-        <w:rPr>
-          <w:rFonts w:ascii="Consolas" w:hAnsi="Consolas"/>
-          <w:b w:val="0"/>
-          <w:color w:val="2A4A3A"/>
-          <w:sz w:val="20"/>
-        </w:rPr>
-        <w:t>pipeline/connect-kick.test.js</w:t>
-      </w:r>
-      <w:r>
-        <w:rPr/>
-        <w:t xml:space="preserve"> (19), </w:t>
-      </w:r>
-      <w:r>
-        <w:rPr>
-          <w:rFonts w:ascii="Consolas" w:hAnsi="Consolas"/>
-          <w:b w:val="0"/>
-          <w:color w:val="2A4A3A"/>
-          <w:sz w:val="20"/>
-        </w:rPr>
-        <w:t>tools/autotxn-connected-live.test.js</w:t>
-      </w:r>
-      <w:r>
-        <w:rPr/>
-        <w:t xml:space="preserve"> (27); </w:t>
-      </w:r>
-      <w:r>
-        <w:rPr>
-          <w:rFonts w:ascii="Consolas" w:hAnsi="Consolas"/>
-          <w:b w:val="0"/>
-          <w:color w:val="2A4A3A"/>
-          <w:sz w:val="20"/>
-        </w:rPr>
-        <w:t>tools/autotxn-return.test.js</w:t>
-      </w:r>
-      <w:r>
-        <w:rPr/>
-        <w:t xml:space="preserve"> extraction marker repaired.</w:t>
+        <w:t xml:space="preserve"> callback maps a </w:t>
+      </w:r>
+      <w:r>
+        <w:rPr>
+          <w:rFonts w:ascii="Consolas" w:hAnsi="Consolas"/>
+          <w:b w:val="0"/>
+          <w:color w:val="2A4A3A"/>
+          <w:sz w:val="20"/>
+        </w:rPr>
+        <w:t>mailbox_grants_one_per_mailbox</w:t>
+      </w:r>
+      <w:r>
+        <w:rPr/>
+        <w:t xml:space="preserve"> unique violation to </w:t>
+      </w:r>
+      <w:r>
+        <w:rPr>
+          <w:rFonts w:ascii="Consolas" w:hAnsi="Consolas"/>
+          <w:b w:val="0"/>
+          <w:color w:val="2A4A3A"/>
+          <w:sz w:val="20"/>
+        </w:rPr>
+        <w:t>reason=mailbox_taken</w:t>
+      </w:r>
+      <w:r>
+        <w:rPr/>
+        <w:t xml:space="preserve"> (no migration); client state </w:t>
+      </w:r>
+      <w:r>
+        <w:rPr>
+          <w:rFonts w:ascii="Consolas" w:hAnsi="Consolas"/>
+          <w:b w:val="0"/>
+          <w:color w:val="2A4A3A"/>
+          <w:sz w:val="20"/>
+        </w:rPr>
+        <w:t>'taken'</w:t>
+      </w:r>
+      <w:r>
+        <w:rPr/>
+        <w:t xml:space="preserve"> with its own sheet. Deployed from </w:t>
+      </w:r>
+      <w:r>
+        <w:rPr>
+          <w:rFonts w:ascii="Consolas" w:hAnsi="Consolas"/>
+          <w:b w:val="0"/>
+          <w:color w:val="2A4A3A"/>
+          <w:sz w:val="20"/>
+        </w:rPr>
+        <w:t>origin/main</w:t>
+      </w:r>
+      <w:r>
+        <w:rPr/>
+        <w:t xml:space="preserve"> code equal to live v8 plus this change only; no shared module other than </w:t>
+      </w:r>
+      <w:r>
+        <w:rPr>
+          <w:rFonts w:ascii="Consolas" w:hAnsi="Consolas"/>
+          <w:b w:val="0"/>
+          <w:color w:val="2A4A3A"/>
+          <w:sz w:val="20"/>
+        </w:rPr>
+        <w:t>gmail.mjs</w:t>
+      </w:r>
+      <w:r>
+        <w:rPr/>
+        <w:t xml:space="preserve"> is imported by the function, and it is unchanged.</w:t>
       </w:r>
     </w:p>
     <w:p>
@@ -30621,7 +30331,20 @@
       </w:r>
       <w:r>
         <w:rPr/>
-        <w:t xml:space="preserve"> §14.1 (callback kicks a targeted read), §14.2 (two triggers → three), §20 (latency table: the "First connect" row had been claiming one notice per backfill run and 150-row chunks — the code notifies once on completion and chunks at 400; corrected, with the live screen and badge rows brought up to date).</w:t>
+        <w:t xml:space="preserve"> none (the one-reader rule is </w:t>
+      </w:r>
+      <w:r>
+        <w:rPr>
+          <w:rFonts w:ascii="Consolas" w:hAnsi="Consolas"/>
+          <w:b w:val="0"/>
+          <w:color w:val="2A4A3A"/>
+          <w:sz w:val="20"/>
+        </w:rPr>
+        <w:t>0103</w:t>
+      </w:r>
+      <w:r>
+        <w:rPr/>
+        <w:t>, unchanged).</w:t>
       </w:r>
     </w:p>
     <w:p>
@@ -30632,21 +30355,23 @@
         <w:rPr>
           <w:b/>
         </w:rPr>
-        <w:t>Measured in production, first connect after deploy</w:t>
-      </w:r>
-      <w:r>
-        <w:rPr/>
-        <w:t xml:space="preserve"> (2026-09-05 08:51, trang.nguyen.wh@, 90-day backfill, 210 rows): watch registered +0.45s after the grant (off-redirect path working), first row staged </w:t>
-      </w:r>
+        <w:t>Watch for:</w:t>
+      </w:r>
+      <w:r>
+        <w:rPr/>
+        <w:t xml:space="preserve"> the takeover question is still open. Refusing is the 0103 behaviour made legible, not a decision that refusing is right.</w:t>
+      </w:r>
+    </w:p>
+    <w:p>
+      <w:pPr>
+        <w:pStyle w:val="Heading3"/>
+      </w:pPr>
       <w:r>
         <w:rPr>
           <w:b/>
-        </w:rPr>
-        <w:t>+4.4s</w:t>
-      </w:r>
-      <w:r>
-        <w:rPr/>
-        <w:t xml:space="preserve"> (previous floor: 60s), completion 08:55:16 with the tail being model-budget stragglers on the minute lane — by design. The other connected mailbox polled normally on the same tick; the kick disturbed nothing.</w:t>
+          <w:sz w:val="23"/>
+        </w:rPr>
+        <w:t>2026-09-13 — client only (review promote, quick sheet) — accounts ask for a starting number; family rows carry the author's instrument</w:t>
       </w:r>
     </w:p>
     <w:p>
@@ -30657,37 +30382,11 @@
         <w:rPr>
           <w:b/>
         </w:rPr>
-        <w:t>Watch for:</w:t>
-      </w:r>
-      <w:r>
-        <w:rPr/>
-        <w:t xml:space="preserve"> the kick assumes </w:t>
-      </w:r>
-      <w:r>
-        <w:rPr>
-          <w:rFonts w:ascii="Consolas" w:hAnsi="Consolas"/>
-          <w:b w:val="0"/>
-          <w:color w:val="2A4A3A"/>
-          <w:sz w:val="20"/>
-        </w:rPr>
-        <w:t>MAILBOX_SYNC_SECRET</w:t>
-      </w:r>
-      <w:r>
-        <w:rPr/>
-        <w:t xml:space="preserve"> is visible to </w:t>
-      </w:r>
-      <w:r>
-        <w:rPr>
-          <w:rFonts w:ascii="Consolas" w:hAnsi="Consolas"/>
-          <w:b w:val="0"/>
-          <w:color w:val="2A4A3A"/>
-          <w:sz w:val="20"/>
-        </w:rPr>
-        <w:t>mailbox-connect</w:t>
-      </w:r>
-      <w:r>
-        <w:rPr/>
-        <w:t xml:space="preserve"> (secrets are project-scoped; verify on deploy — absent, it silently degrades to the old minute-lane latency, visible as "connect kick" lines missing from mailbox-connect logs). Deliberately NOT changed: a multi-run backfill still push-notifies only on completion — the live screen covers the interim, and the notify decision block was left untouched on purpose (it is the code the 2026-08-30 sixty-notices incident lives next to).</w:t>
+        <w:t>For product:</w:t>
+      </w:r>
+      <w:r>
+        <w:rPr/>
+        <w:t xml:space="preserve"> after the first import from the queue, the app now asks for the balance the bank app shows, one screen per card or account the import touched ("Xác nhận số dư", "Để sau" on each). Until then a captured account shows no number, only "Chạm để thiết lập". A family-scoped row still names the card it was paid with, so that card's outstanding is right even for a household that files everything to Gia đình.</w:t>
       </w:r>
     </w:p>
     <w:p>
@@ -30698,6 +30397,928 @@
         <w:rPr>
           <w:b/>
         </w:rPr>
+        <w:t>Under the hood:</w:t>
+      </w:r>
+      <w:r>
+        <w:rPr/>
+        <w:t xml:space="preserve"> </w:t>
+      </w:r>
+      <w:r>
+        <w:rPr>
+          <w:rFonts w:ascii="Consolas" w:hAnsi="Consolas"/>
+          <w:b w:val="0"/>
+          <w:color w:val="2A4A3A"/>
+          <w:sz w:val="20"/>
+        </w:rPr>
+        <w:t>_fhPromoteStagedRun</w:t>
+      </w:r>
+      <w:r>
+        <w:rPr/>
+        <w:t xml:space="preserve"> collects the accounts a batch touched (personal specs' </w:t>
+      </w:r>
+      <w:r>
+        <w:rPr>
+          <w:rFonts w:ascii="Consolas" w:hAnsi="Consolas"/>
+          <w:b w:val="0"/>
+          <w:color w:val="2A4A3A"/>
+          <w:sz w:val="20"/>
+        </w:rPr>
+        <w:t>accountId</w:t>
+      </w:r>
+      <w:r>
+        <w:rPr/>
+        <w:t xml:space="preserve">, family rows' resolved instrument, and </w:t>
+      </w:r>
+      <w:r>
+        <w:rPr>
+          <w:rFonts w:ascii="Consolas" w:hAnsi="Consolas"/>
+          <w:b w:val="0"/>
+          <w:color w:val="2A4A3A"/>
+          <w:sz w:val="20"/>
+        </w:rPr>
+        <w:t>_fhQueueNewAccts</w:t>
+      </w:r>
+      <w:r>
+        <w:rPr/>
+        <w:t xml:space="preserve"> from the eager materialization) and calls </w:t>
+      </w:r>
+      <w:r>
+        <w:rPr>
+          <w:rFonts w:ascii="Consolas" w:hAnsi="Consolas"/>
+          <w:b w:val="0"/>
+          <w:color w:val="2A4A3A"/>
+          <w:sz w:val="20"/>
+        </w:rPr>
+        <w:t>fhAcctSetupAfterImport</w:t>
+      </w:r>
+      <w:r>
+        <w:rPr/>
+        <w:t xml:space="preserve"> after the review closes; the post-import push offer (</w:t>
+      </w:r>
+      <w:r>
+        <w:rPr>
+          <w:rFonts w:ascii="Consolas" w:hAnsi="Consolas"/>
+          <w:b w:val="0"/>
+          <w:color w:val="2A4A3A"/>
+          <w:sz w:val="20"/>
+        </w:rPr>
+        <w:t>_mbxPushOfferOnce</w:t>
+      </w:r>
+      <w:r>
+        <w:rPr/>
+        <w:t xml:space="preserve">) is removed from this path (moved to the first home visit). Family-scoped candidates get </w:t>
+      </w:r>
+      <w:r>
+        <w:rPr>
+          <w:rFonts w:ascii="Consolas" w:hAnsi="Consolas"/>
+          <w:b w:val="0"/>
+          <w:color w:val="2A4A3A"/>
+          <w:sz w:val="20"/>
+        </w:rPr>
+        <w:t>_pAcct</w:t>
+      </w:r>
+      <w:r>
+        <w:rPr/>
+        <w:t xml:space="preserve"> + a reserved </w:t>
+      </w:r>
+      <w:r>
+        <w:rPr>
+          <w:rFonts w:ascii="Consolas" w:hAnsi="Consolas"/>
+          <w:b w:val="0"/>
+          <w:color w:val="2A4A3A"/>
+          <w:sz w:val="20"/>
+        </w:rPr>
+        <w:t>_link</w:t>
+      </w:r>
+      <w:r>
+        <w:rPr/>
+        <w:t xml:space="preserve">, carried by </w:t>
+      </w:r>
+      <w:r>
+        <w:rPr>
+          <w:rFonts w:ascii="Consolas" w:hAnsi="Consolas"/>
+          <w:b w:val="0"/>
+          <w:color w:val="2A4A3A"/>
+          <w:sz w:val="20"/>
+        </w:rPr>
+        <w:t>csvPromote</w:t>
+      </w:r>
+      <w:r>
+        <w:rPr/>
+        <w:t xml:space="preserve"> → </w:t>
+      </w:r>
+      <w:r>
+        <w:rPr>
+          <w:rFonts w:ascii="Consolas" w:hAnsi="Consolas"/>
+          <w:b w:val="0"/>
+          <w:color w:val="2A4A3A"/>
+          <w:sz w:val="20"/>
+        </w:rPr>
+        <w:t>submitBulk</w:t>
+      </w:r>
+      <w:r>
+        <w:rPr/>
+        <w:t xml:space="preserve"> → the write-through → </w:t>
+      </w:r>
+      <w:r>
+        <w:rPr>
+          <w:rFonts w:ascii="Consolas" w:hAnsi="Consolas"/>
+          <w:b w:val="0"/>
+          <w:color w:val="2A4A3A"/>
+          <w:sz w:val="20"/>
+        </w:rPr>
+        <w:t>_dbInsertTxn</w:t>
+      </w:r>
+      <w:r>
+        <w:rPr/>
+        <w:t xml:space="preserve">, which pre-sets </w:t>
+      </w:r>
+      <w:r>
+        <w:rPr>
+          <w:rFonts w:ascii="Consolas" w:hAnsi="Consolas"/>
+          <w:b w:val="0"/>
+          <w:color w:val="2A4A3A"/>
+          <w:sz w:val="20"/>
+        </w:rPr>
+        <w:t>link_id</w:t>
+      </w:r>
+      <w:r>
+        <w:rPr/>
+        <w:t xml:space="preserve"> on the family row and inserts the tagged mirror master. The quick sheet's family write does the same for one row. No pipeline change.</w:t>
+      </w:r>
+    </w:p>
+    <w:p>
+      <w:pPr>
+        <w:pStyle w:val="ListBullet"/>
+      </w:pPr>
+      <w:r>
+        <w:rPr>
+          <w:b/>
+        </w:rPr>
+        <w:t>Spec sections updated:</w:t>
+      </w:r>
+      <w:r>
+        <w:rPr/>
+        <w:t xml:space="preserve"> new account-setup-spec.md; §19.4 step 4 (family rows now carry the author's account tag to the master); §24 "nothing records which bank accounts are yours" is closed by </w:t>
+      </w:r>
+      <w:r>
+        <w:rPr>
+          <w:rFonts w:ascii="Consolas" w:hAnsi="Consolas"/>
+          <w:b w:val="0"/>
+          <w:color w:val="2A4A3A"/>
+          <w:sz w:val="20"/>
+        </w:rPr>
+        <w:t>personal_accounts</w:t>
+      </w:r>
+      <w:r>
+        <w:rPr/>
+        <w:t xml:space="preserve"> + the setup anchor.</w:t>
+      </w:r>
+    </w:p>
+    <w:p>
+      <w:pPr>
+        <w:pStyle w:val="Heading3"/>
+      </w:pPr>
+      <w:r>
+        <w:rPr>
+          <w:b/>
+          <w:sz w:val="23"/>
+        </w:rPr>
+        <w:t>2026-09-07 — extraction + review + template learner — a card repayment names the card it pays off</w:t>
+      </w:r>
+    </w:p>
+    <w:p>
+      <w:pPr>
+        <w:pStyle w:val="ListBullet"/>
+      </w:pPr>
+      <w:r>
+        <w:rPr>
+          <w:b/>
+        </w:rPr>
+        <w:t>For product:</w:t>
+      </w:r>
+      <w:r>
+        <w:rPr/>
+        <w:t xml:space="preserve"> a "Trả nợ thẻ" row now pre-selects </w:t>
+      </w:r>
+      <w:r>
+        <w:rPr>
+          <w:b/>
+        </w:rPr>
+        <w:t>which</w:t>
+      </w:r>
+      <w:r>
+        <w:rPr/>
+        <w:t xml:space="preserve"> credit card is being paid, instead of showing "Chưa rõ", whenever the bank's email names a card you own — so the repayment draws the right card's balance down without you assigning it by hand. Ambiguous rows still show "Chưa rõ" (editable).</w:t>
+      </w:r>
+    </w:p>
+    <w:p>
+      <w:pPr>
+        <w:pStyle w:val="ListBullet"/>
+      </w:pPr>
+      <w:r>
+        <w:rPr>
+          <w:b/>
+        </w:rPr>
+        <w:t>Under the hood:</w:t>
+      </w:r>
+      <w:r>
+        <w:rPr/>
+        <w:t xml:space="preserve"> new </w:t>
+      </w:r>
+      <w:r>
+        <w:rPr>
+          <w:rFonts w:ascii="Consolas" w:hAnsi="Consolas"/>
+          <w:b w:val="0"/>
+          <w:color w:val="2A4A3A"/>
+          <w:sz w:val="20"/>
+        </w:rPr>
+        <w:t>card_masked</w:t>
+      </w:r>
+      <w:r>
+        <w:rPr/>
+        <w:t xml:space="preserve"> content field (the repaid card, last-4, inside the sealed box — no new column). </w:t>
+      </w:r>
+      <w:r>
+        <w:rPr>
+          <w:rFonts w:ascii="Consolas" w:hAnsi="Consolas"/>
+          <w:b w:val="0"/>
+          <w:color w:val="2A4A3A"/>
+          <w:sz w:val="20"/>
+        </w:rPr>
+        <w:t>labeltable.mjs</w:t>
+      </w:r>
+      <w:r>
+        <w:rPr/>
+        <w:t xml:space="preserve"> emits its already- matched </w:t>
+      </w:r>
+      <w:r>
+        <w:rPr>
+          <w:rFonts w:ascii="Consolas" w:hAnsi="Consolas"/>
+          <w:b w:val="0"/>
+          <w:color w:val="2A4A3A"/>
+          <w:sz w:val="20"/>
+        </w:rPr>
+        <w:t>card</w:t>
+      </w:r>
+      <w:r>
+        <w:rPr/>
+        <w:t xml:space="preserve"> row and broadens the repayment vocabulary; </w:t>
+      </w:r>
+      <w:r>
+        <w:rPr>
+          <w:rFonts w:ascii="Consolas" w:hAnsi="Consolas"/>
+          <w:b w:val="0"/>
+          <w:color w:val="2A4A3A"/>
+          <w:sz w:val="20"/>
+        </w:rPr>
+        <w:t>llm.mjs</w:t>
+      </w:r>
+      <w:r>
+        <w:rPr/>
+        <w:t xml:space="preserve"> gains an optional </w:t>
+      </w:r>
+      <w:r>
+        <w:rPr>
+          <w:rFonts w:ascii="Consolas" w:hAnsi="Consolas"/>
+          <w:b w:val="0"/>
+          <w:color w:val="2A4A3A"/>
+          <w:sz w:val="20"/>
+        </w:rPr>
+        <w:t>card_masked</w:t>
+      </w:r>
+      <w:r>
+        <w:rPr/>
+        <w:t xml:space="preserve"> property + prompt rule; </w:t>
+      </w:r>
+      <w:r>
+        <w:rPr>
+          <w:rFonts w:ascii="Consolas" w:hAnsi="Consolas"/>
+          <w:b w:val="0"/>
+          <w:color w:val="2A4A3A"/>
+          <w:sz w:val="20"/>
+        </w:rPr>
+        <w:t>templates.mjs</w:t>
+      </w:r>
+      <w:r>
+        <w:rPr/>
+        <w:t xml:space="preserve"> graduates it (strFields + proof, degradable like </w:t>
+      </w:r>
+      <w:r>
+        <w:rPr>
+          <w:rFonts w:ascii="Consolas" w:hAnsi="Consolas"/>
+          <w:b w:val="0"/>
+          <w:color w:val="2A4A3A"/>
+          <w:sz w:val="20"/>
+        </w:rPr>
+        <w:t>account_masked</w:t>
+      </w:r>
+      <w:r>
+        <w:rPr/>
+        <w:t xml:space="preserve">); </w:t>
+      </w:r>
+      <w:r>
+        <w:rPr>
+          <w:rFonts w:ascii="Consolas" w:hAnsi="Consolas"/>
+          <w:b w:val="0"/>
+          <w:color w:val="2A4A3A"/>
+          <w:sz w:val="20"/>
+        </w:rPr>
+        <w:t>_tidy</w:t>
+      </w:r>
+      <w:r>
+        <w:rPr/>
+        <w:t xml:space="preserve"> masks it; </w:t>
+      </w:r>
+      <w:r>
+        <w:rPr>
+          <w:rFonts w:ascii="Consolas" w:hAnsi="Consolas"/>
+          <w:b w:val="0"/>
+          <w:color w:val="2A4A3A"/>
+          <w:sz w:val="20"/>
+        </w:rPr>
+        <w:t>stage.mjs</w:t>
+      </w:r>
+      <w:r>
+        <w:rPr/>
+        <w:t xml:space="preserve"> carries it. Client: one shared </w:t>
+      </w:r>
+      <w:r>
+        <w:rPr>
+          <w:rFonts w:ascii="Consolas" w:hAnsi="Consolas"/>
+          <w:b w:val="0"/>
+          <w:color w:val="2A4A3A"/>
+          <w:sz w:val="20"/>
+        </w:rPr>
+        <w:t>fhResolveRepaidCard</w:t>
+      </w:r>
+      <w:r>
+        <w:rPr/>
+        <w:t xml:space="preserve"> (</w:t>
+      </w:r>
+      <w:r>
+        <w:rPr>
+          <w:rFonts w:ascii="Consolas" w:hAnsi="Consolas"/>
+          <w:b w:val="0"/>
+          <w:color w:val="2A4A3A"/>
+          <w:sz w:val="20"/>
+        </w:rPr>
+        <w:t>72-txn-review.js</w:t>
+      </w:r>
+      <w:r>
+        <w:rPr/>
+        <w:t xml:space="preserve">) — card_masked → credit-card </w:t>
+      </w:r>
+      <w:r>
+        <w:rPr>
+          <w:rFonts w:ascii="Consolas" w:hAnsi="Consolas"/>
+          <w:b w:val="0"/>
+          <w:color w:val="2A4A3A"/>
+          <w:sz w:val="20"/>
+        </w:rPr>
+        <w:t>account_masked</w:t>
+      </w:r>
+      <w:r>
+        <w:rPr/>
+        <w:t xml:space="preserve"> → memo/ref digits → one-card default → null — set as </w:t>
+      </w:r>
+      <w:r>
+        <w:rPr>
+          <w:rFonts w:ascii="Consolas" w:hAnsi="Consolas"/>
+          <w:b w:val="0"/>
+          <w:color w:val="2A4A3A"/>
+          <w:sz w:val="20"/>
+        </w:rPr>
+        <w:t>_payCardId</w:t>
+      </w:r>
+      <w:r>
+        <w:rPr/>
+        <w:t xml:space="preserve"> at candidate build (</w:t>
+      </w:r>
+      <w:r>
+        <w:rPr>
+          <w:rFonts w:ascii="Consolas" w:hAnsi="Consolas"/>
+          <w:b w:val="0"/>
+          <w:color w:val="2A4A3A"/>
+          <w:sz w:val="20"/>
+        </w:rPr>
+        <w:t>57-csv-import-review.js</w:t>
+      </w:r>
+      <w:r>
+        <w:rPr/>
+        <w:t>) and preferred in promote. Layer 1 (client) fixes the card-side-alert case with no deploy; Layer 2 (pipeline) fixes account-side alerts where the card number was previously dropped.</w:t>
+      </w:r>
+    </w:p>
+    <w:p>
+      <w:pPr>
+        <w:pStyle w:val="ListBullet"/>
+      </w:pPr>
+      <w:r>
+        <w:rPr>
+          <w:b/>
+        </w:rPr>
+        <w:t>Spec sections updated:</w:t>
+      </w:r>
+      <w:r>
+        <w:rPr/>
+        <w:t xml:space="preserve"> new card-repayment-routing-spec.md; §24 (account_masked routing) cross-linked; extraction reference §3 field map (</w:t>
+      </w:r>
+      <w:r>
+        <w:rPr>
+          <w:rFonts w:ascii="Consolas" w:hAnsi="Consolas"/>
+          <w:b w:val="0"/>
+          <w:color w:val="2A4A3A"/>
+          <w:sz w:val="20"/>
+        </w:rPr>
+        <w:t>card</w:t>
+      </w:r>
+      <w:r>
+        <w:rPr/>
+        <w:t xml:space="preserve"> → </w:t>
+      </w:r>
+      <w:r>
+        <w:rPr>
+          <w:rFonts w:ascii="Consolas" w:hAnsi="Consolas"/>
+          <w:b w:val="0"/>
+          <w:color w:val="2A4A3A"/>
+          <w:sz w:val="20"/>
+        </w:rPr>
+        <w:t>card_masked</w:t>
+      </w:r>
+      <w:r>
+        <w:rPr/>
+        <w:t>).</w:t>
+      </w:r>
+    </w:p>
+    <w:p>
+      <w:pPr>
+        <w:pStyle w:val="Heading3"/>
+      </w:pPr>
+      <w:r>
+        <w:rPr>
+          <w:b/>
+          <w:sz w:val="23"/>
+        </w:rPr>
+        <w:t>2026-09-05 — mailbox-connect + mailbox-sync + client (DEPLOYED 2026-09-05) — the first minute after connect stops being silent</w:t>
+      </w:r>
+    </w:p>
+    <w:p>
+      <w:pPr>
+        <w:pStyle w:val="ListBullet"/>
+      </w:pPr>
+      <w:r>
+        <w:rPr>
+          <w:b/>
+        </w:rPr>
+        <w:t>For product:</w:t>
+      </w:r>
+      <w:r>
+        <w:rPr/>
+        <w:t xml:space="preserve"> connecting Gmail now shows results while you watch. The first read starts within seconds of tapping Allow instead of waiting up to a minute for the cron lane, and the "Đã kết nối" screen is live: it counts the transactions as they land ("Tìm được 12 khoản…"), turns its button into "Xem 12 khoản", and keeps the badge in step — before, the screen was static, the badge only moved on app-open or refocus, and a person's first minute with the feature was an empty screen they read as "it didn't work". Both OAuth screens (success and status) now also offer to turn notifications on; that offer used to exist only on the forwarding screen and after a first hand-review, so an OAuth user had no push subscription and every "something is waiting" push landed nowhere.</w:t>
+      </w:r>
+    </w:p>
+    <w:p>
+      <w:pPr>
+        <w:pStyle w:val="ListBullet"/>
+      </w:pPr>
+      <w:r>
+        <w:rPr>
+          <w:b/>
+        </w:rPr>
+        <w:t>Under the hood:</w:t>
+      </w:r>
+      <w:r>
+        <w:rPr/>
+        <w:t xml:space="preserve"> </w:t>
+      </w:r>
+      <w:r>
+        <w:rPr>
+          <w:rFonts w:ascii="Consolas" w:hAnsi="Consolas"/>
+          <w:b w:val="0"/>
+          <w:color w:val="2A4A3A"/>
+          <w:sz w:val="20"/>
+        </w:rPr>
+        <w:t>mailbox-connect</w:t>
+      </w:r>
+      <w:r>
+        <w:rPr/>
+        <w:t xml:space="preserve"> </w:t>
+      </w:r>
+      <w:r>
+        <w:rPr>
+          <w:rFonts w:ascii="Consolas" w:hAnsi="Consolas"/>
+          <w:b w:val="0"/>
+          <w:color w:val="2A4A3A"/>
+          <w:sz w:val="20"/>
+        </w:rPr>
+        <w:t>/callback</w:t>
+      </w:r>
+      <w:r>
+        <w:rPr/>
+        <w:t xml:space="preserve"> fires a fire-and-forget </w:t>
+      </w:r>
+      <w:r>
+        <w:rPr>
+          <w:rFonts w:ascii="Consolas" w:hAnsi="Consolas"/>
+          <w:b w:val="0"/>
+          <w:color w:val="2A4A3A"/>
+          <w:sz w:val="20"/>
+        </w:rPr>
+        <w:t>POST /mailbox-sync</w:t>
+      </w:r>
+      <w:r>
+        <w:rPr/>
+        <w:t xml:space="preserve"> </w:t>
+      </w:r>
+      <w:r>
+        <w:rPr>
+          <w:rFonts w:ascii="Consolas" w:hAnsi="Consolas"/>
+          <w:b w:val="0"/>
+          <w:color w:val="2A4A3A"/>
+          <w:sz w:val="20"/>
+        </w:rPr>
+        <w:t>{grant: &lt;id&gt;}</w:t>
+      </w:r>
+      <w:r>
+        <w:rPr/>
+        <w:t xml:space="preserve"> (shared secret, </w:t>
+      </w:r>
+      <w:r>
+        <w:rPr>
+          <w:rFonts w:ascii="Consolas" w:hAnsi="Consolas"/>
+          <w:b w:val="0"/>
+          <w:color w:val="2A4A3A"/>
+          <w:sz w:val="20"/>
+        </w:rPr>
+        <w:t>EdgeRuntime.waitUntil</w:t>
+      </w:r>
+      <w:r>
+        <w:rPr/>
+        <w:t>, before watch registration; best effort), and the watch registration itself moved off the redirect path (</w:t>
+      </w:r>
+      <w:r>
+        <w:rPr>
+          <w:rFonts w:ascii="Consolas" w:hAnsi="Consolas"/>
+          <w:b w:val="0"/>
+          <w:color w:val="2A4A3A"/>
+          <w:sz w:val="20"/>
+        </w:rPr>
+        <w:t>registerWatchBestEffort</w:t>
+      </w:r>
+      <w:r>
+        <w:rPr/>
+        <w:t xml:space="preserve">, same </w:t>
+      </w:r>
+      <w:r>
+        <w:rPr>
+          <w:rFonts w:ascii="Consolas" w:hAnsi="Consolas"/>
+          <w:b w:val="0"/>
+          <w:color w:val="2A4A3A"/>
+          <w:sz w:val="20"/>
+        </w:rPr>
+        <w:t>waitUntil</w:t>
+      </w:r>
+      <w:r>
+        <w:rPr/>
+        <w:t xml:space="preserve">; a lost registration is due-on-null for the renewal sweep) — the redirect returns ~0.5–1s sooner. </w:t>
+      </w:r>
+      <w:r>
+        <w:rPr>
+          <w:rFonts w:ascii="Consolas" w:hAnsi="Consolas"/>
+          <w:b w:val="0"/>
+          <w:color w:val="2A4A3A"/>
+          <w:sz w:val="20"/>
+        </w:rPr>
+        <w:t>mailbox-sync</w:t>
+      </w:r>
+      <w:r>
+        <w:rPr/>
+        <w:t xml:space="preserve"> routes the </w:t>
+      </w:r>
+      <w:r>
+        <w:rPr>
+          <w:rFonts w:ascii="Consolas" w:hAnsi="Consolas"/>
+          <w:b w:val="0"/>
+          <w:color w:val="2A4A3A"/>
+          <w:sz w:val="20"/>
+        </w:rPr>
+        <w:t>{grant}</w:t>
+      </w:r>
+      <w:r>
+        <w:rPr/>
+        <w:t xml:space="preserve"> body to new </w:t>
+      </w:r>
+      <w:r>
+        <w:rPr>
+          <w:rFonts w:ascii="Consolas" w:hAnsi="Consolas"/>
+          <w:b w:val="0"/>
+          <w:color w:val="2A4A3A"/>
+          <w:sz w:val="20"/>
+        </w:rPr>
+        <w:t>worker.runOne(grantId, ctx)</w:t>
+      </w:r>
+      <w:r>
+        <w:rPr/>
+        <w:t xml:space="preserve"> — the same lane body </w:t>
+      </w:r>
+      <w:r>
+        <w:rPr>
+          <w:rFonts w:ascii="Consolas" w:hAnsi="Consolas"/>
+          <w:b w:val="0"/>
+          <w:color w:val="2A4A3A"/>
+          <w:sz w:val="20"/>
+        </w:rPr>
+        <w:t>runAll</w:t>
+      </w:r>
+      <w:r>
+        <w:rPr/>
+        <w:t xml:space="preserve"> runs, scoped to one grant via new </w:t>
+      </w:r>
+      <w:r>
+        <w:rPr>
+          <w:rFonts w:ascii="Consolas" w:hAnsi="Consolas"/>
+          <w:b w:val="0"/>
+          <w:color w:val="2A4A3A"/>
+          <w:sz w:val="20"/>
+        </w:rPr>
+        <w:t>db.grantById</w:t>
+      </w:r>
+      <w:r>
+        <w:rPr/>
+        <w:t xml:space="preserve"> (same columns and </w:t>
+      </w:r>
+      <w:r>
+        <w:rPr>
+          <w:rFonts w:ascii="Consolas" w:hAnsi="Consolas"/>
+          <w:b w:val="0"/>
+          <w:color w:val="2A4A3A"/>
+          <w:sz w:val="20"/>
+        </w:rPr>
+        <w:t>needs_reauth</w:t>
+      </w:r>
+      <w:r>
+        <w:rPr/>
+        <w:t xml:space="preserve"> filter as </w:t>
+      </w:r>
+      <w:r>
+        <w:rPr>
+          <w:rFonts w:ascii="Consolas" w:hAnsi="Consolas"/>
+          <w:b w:val="0"/>
+          <w:color w:val="2A4A3A"/>
+          <w:sz w:val="20"/>
+        </w:rPr>
+        <w:t>dueGrants</w:t>
+      </w:r>
+      <w:r>
+        <w:rPr/>
+        <w:t xml:space="preserve">). Purely additive: </w:t>
+      </w:r>
+      <w:r>
+        <w:rPr>
+          <w:rFonts w:ascii="Consolas" w:hAnsi="Consolas"/>
+          <w:b w:val="0"/>
+          <w:color w:val="2A4A3A"/>
+          <w:sz w:val="20"/>
+        </w:rPr>
+        <w:t>runAll</w:t>
+      </w:r>
+      <w:r>
+        <w:rPr/>
+        <w:t>/</w:t>
+      </w:r>
+      <w:r>
+        <w:rPr>
+          <w:rFonts w:ascii="Consolas" w:hAnsi="Consolas"/>
+          <w:b w:val="0"/>
+          <w:color w:val="2A4A3A"/>
+          <w:sz w:val="20"/>
+        </w:rPr>
+        <w:t>runGrant</w:t>
+      </w:r>
+      <w:r>
+        <w:rPr/>
+        <w:t xml:space="preserve">/notify logic untouched; overlap with a cron run is the sanctioned 0097 shape. Client: </w:t>
+      </w:r>
+      <w:r>
+        <w:rPr>
+          <w:rFonts w:ascii="Consolas" w:hAnsi="Consolas"/>
+          <w:b w:val="0"/>
+          <w:color w:val="2A4A3A"/>
+          <w:sz w:val="20"/>
+        </w:rPr>
+        <w:t>74-autotxn-ui.js</w:t>
+      </w:r>
+      <w:r>
+        <w:rPr/>
+        <w:t xml:space="preserve"> gains </w:t>
+      </w:r>
+      <w:r>
+        <w:rPr>
+          <w:rFonts w:ascii="Consolas" w:hAnsi="Consolas"/>
+          <w:b w:val="0"/>
+          <w:color w:val="2A4A3A"/>
+          <w:sz w:val="20"/>
+        </w:rPr>
+        <w:t>_atxLiveWatch</w:t>
+      </w:r>
+      <w:r>
+        <w:rPr/>
+        <w:t xml:space="preserve"> — head-only pending count, eager 1.5s cadence until the first find (max 20s) then 4s, and closing the sheet DEMOTES it to badge-only polling (badge keeps moving, dead sheet DOM untouched) rather than stopping; the 3-minute window ends with one reconciling </w:t>
+      </w:r>
+      <w:r>
+        <w:rPr>
+          <w:rFonts w:ascii="Consolas" w:hAnsi="Consolas"/>
+          <w:b w:val="0"/>
+          <w:color w:val="2A4A3A"/>
+          <w:sz w:val="20"/>
+        </w:rPr>
+        <w:t>fhRefreshStagedCount</w:t>
+      </w:r>
+      <w:r>
+        <w:rPr/>
+        <w:t xml:space="preserve"> — and </w:t>
+      </w:r>
+      <w:r>
+        <w:rPr>
+          <w:rFonts w:ascii="Consolas" w:hAnsi="Consolas"/>
+          <w:b w:val="0"/>
+          <w:color w:val="2A4A3A"/>
+          <w:sz w:val="20"/>
+        </w:rPr>
+        <w:t>_atxPushRowSafe</w:t>
+      </w:r>
+      <w:r>
+        <w:rPr/>
+        <w:t xml:space="preserve"> (reuses 71's </w:t>
+      </w:r>
+      <w:r>
+        <w:rPr>
+          <w:rFonts w:ascii="Consolas" w:hAnsi="Consolas"/>
+          <w:b w:val="0"/>
+          <w:color w:val="2A4A3A"/>
+          <w:sz w:val="20"/>
+        </w:rPr>
+        <w:t>_mbxPushRow</w:t>
+      </w:r>
+      <w:r>
+        <w:rPr/>
+        <w:t xml:space="preserve">, resolved pre-render); </w:t>
+      </w:r>
+      <w:r>
+        <w:rPr>
+          <w:rFonts w:ascii="Consolas" w:hAnsi="Consolas"/>
+          <w:b w:val="0"/>
+          <w:color w:val="2A4A3A"/>
+          <w:sz w:val="20"/>
+        </w:rPr>
+        <w:t>fhAutoTxnDone</w:t>
+      </w:r>
+      <w:r>
+        <w:rPr/>
+        <w:t xml:space="preserve"> and </w:t>
+      </w:r>
+      <w:r>
+        <w:rPr>
+          <w:rFonts w:ascii="Consolas" w:hAnsi="Consolas"/>
+          <w:b w:val="0"/>
+          <w:color w:val="2A4A3A"/>
+          <w:sz w:val="20"/>
+        </w:rPr>
+        <w:t>fhAutoTxnStatus</w:t>
+      </w:r>
+      <w:r>
+        <w:rPr/>
+        <w:t xml:space="preserve"> are async + seq-guarded. Tests: </w:t>
+      </w:r>
+      <w:r>
+        <w:rPr>
+          <w:rFonts w:ascii="Consolas" w:hAnsi="Consolas"/>
+          <w:b w:val="0"/>
+          <w:color w:val="2A4A3A"/>
+          <w:sz w:val="20"/>
+        </w:rPr>
+        <w:t>pipeline/connect-kick.test.js</w:t>
+      </w:r>
+      <w:r>
+        <w:rPr/>
+        <w:t xml:space="preserve"> (19), </w:t>
+      </w:r>
+      <w:r>
+        <w:rPr>
+          <w:rFonts w:ascii="Consolas" w:hAnsi="Consolas"/>
+          <w:b w:val="0"/>
+          <w:color w:val="2A4A3A"/>
+          <w:sz w:val="20"/>
+        </w:rPr>
+        <w:t>tools/autotxn-connected-live.test.js</w:t>
+      </w:r>
+      <w:r>
+        <w:rPr/>
+        <w:t xml:space="preserve"> (27); </w:t>
+      </w:r>
+      <w:r>
+        <w:rPr>
+          <w:rFonts w:ascii="Consolas" w:hAnsi="Consolas"/>
+          <w:b w:val="0"/>
+          <w:color w:val="2A4A3A"/>
+          <w:sz w:val="20"/>
+        </w:rPr>
+        <w:t>tools/autotxn-return.test.js</w:t>
+      </w:r>
+      <w:r>
+        <w:rPr/>
+        <w:t xml:space="preserve"> extraction marker repaired.</w:t>
+      </w:r>
+    </w:p>
+    <w:p>
+      <w:pPr>
+        <w:pStyle w:val="ListBullet"/>
+      </w:pPr>
+      <w:r>
+        <w:rPr>
+          <w:b/>
+        </w:rPr>
+        <w:t>Spec sections updated:</w:t>
+      </w:r>
+      <w:r>
+        <w:rPr/>
+        <w:t xml:space="preserve"> §14.1 (callback kicks a targeted read), §14.2 (two triggers → three), §20 (latency table: the "First connect" row had been claiming one notice per backfill run and 150-row chunks — the code notifies once on completion and chunks at 400; corrected, with the live screen and badge rows brought up to date).</w:t>
+      </w:r>
+    </w:p>
+    <w:p>
+      <w:pPr>
+        <w:pStyle w:val="ListBullet"/>
+      </w:pPr>
+      <w:r>
+        <w:rPr>
+          <w:b/>
+        </w:rPr>
+        <w:t>Measured in production, first connect after deploy</w:t>
+      </w:r>
+      <w:r>
+        <w:rPr/>
+        <w:t xml:space="preserve"> (2026-09-05 08:51, trang.nguyen.wh@, 90-day backfill, 210 rows): watch registered +0.45s after the grant (off-redirect path working), first row staged </w:t>
+      </w:r>
+      <w:r>
+        <w:rPr>
+          <w:b/>
+        </w:rPr>
+        <w:t>+4.4s</w:t>
+      </w:r>
+      <w:r>
+        <w:rPr/>
+        <w:t xml:space="preserve"> (previous floor: 60s), completion 08:55:16 with the tail being model-budget stragglers on the minute lane — by design. The other connected mailbox polled normally on the same tick; the kick disturbed nothing.</w:t>
+      </w:r>
+    </w:p>
+    <w:p>
+      <w:pPr>
+        <w:pStyle w:val="ListBullet"/>
+      </w:pPr>
+      <w:r>
+        <w:rPr>
+          <w:b/>
+        </w:rPr>
+        <w:t>Watch for:</w:t>
+      </w:r>
+      <w:r>
+        <w:rPr/>
+        <w:t xml:space="preserve"> the kick assumes </w:t>
+      </w:r>
+      <w:r>
+        <w:rPr>
+          <w:rFonts w:ascii="Consolas" w:hAnsi="Consolas"/>
+          <w:b w:val="0"/>
+          <w:color w:val="2A4A3A"/>
+          <w:sz w:val="20"/>
+        </w:rPr>
+        <w:t>MAILBOX_SYNC_SECRET</w:t>
+      </w:r>
+      <w:r>
+        <w:rPr/>
+        <w:t xml:space="preserve"> is visible to </w:t>
+      </w:r>
+      <w:r>
+        <w:rPr>
+          <w:rFonts w:ascii="Consolas" w:hAnsi="Consolas"/>
+          <w:b w:val="0"/>
+          <w:color w:val="2A4A3A"/>
+          <w:sz w:val="20"/>
+        </w:rPr>
+        <w:t>mailbox-connect</w:t>
+      </w:r>
+      <w:r>
+        <w:rPr/>
+        <w:t xml:space="preserve"> (secrets are project-scoped; verify on deploy — absent, it silently degrades to the old minute-lane latency, visible as "connect kick" lines missing from mailbox-connect logs). Deliberately NOT changed: a multi-run backfill still push-notifies only on completion — the live screen covers the interim, and the notify decision block was left untouched on purpose (it is the code the 2026-08-30 sixty-notices incident lives next to).</w:t>
+      </w:r>
+    </w:p>
+    <w:p>
+      <w:pPr>
+        <w:pStyle w:val="ListBullet"/>
+      </w:pPr>
+      <w:r>
+        <w:rPr>
+          <w:b/>
+        </w:rPr>
         <w:t>Same-day follow-up (Hien's session, 3baf624 · 037318e · d2972ad):</w:t>
       </w:r>
       <w:r>
@@ -30729,6 +31350,115 @@
       <w:r>
         <w:rPr/>
         <w:t>) written and pushed, NOT yet applied at the time of that entry — the client's three-tier select ladder degrades gracefully until it is. Details in AGENT_SYNC (2026-09-05, Hien's session).</w:t>
+      </w:r>
+    </w:p>
+    <w:p>
+      <w:pPr>
+        <w:pStyle w:val="Heading3"/>
+      </w:pPr>
+      <w:r>
+        <w:rPr>
+          <w:b/>
+          <w:sz w:val="23"/>
+        </w:rPr>
+        <w:t>2026-09-04 — transaction-parser deterministic-first revamp (not deployed)</w:t>
+      </w:r>
+    </w:p>
+    <w:p>
+      <w:pPr>
+        <w:pStyle w:val="ListBullet"/>
+      </w:pPr>
+      <w:r>
+        <w:rPr/>
+        <w:t>Added a typed email interface while retaining the legacy call form during rollout, plus normalized email, detection, match-state and structured failure models.</w:t>
+      </w:r>
+    </w:p>
+    <w:p>
+      <w:pPr>
+        <w:pStyle w:val="ListBullet"/>
+      </w:pPr>
+      <w:r>
+        <w:rPr/>
+        <w:t>Inserted a deterministic bilingual label-table reader between stored specs and Gemini. It covers anonymized MB, Vietcombank, VIB, Techcombank and MoMo shapes and rejects declined or foreign-currency rows it cannot represent.</w:t>
+      </w:r>
+    </w:p>
+    <w:p>
+      <w:pPr>
+        <w:pStyle w:val="ListBullet"/>
+      </w:pPr>
+      <w:r>
+        <w:rPr/>
+        <w:t>Ported the proven safety heuristics for time-first dates, dynamic signs, amount absorbers, footer merchants, account-tail masking and full-field learned-template replay.</w:t>
+      </w:r>
+    </w:p>
+    <w:p>
+      <w:pPr>
+        <w:pStyle w:val="ListBullet"/>
+      </w:pPr>
+      <w:r>
+        <w:rPr/>
+        <w:t>Removed financial and mail-authored values from Cloud Logging and Telegram.</w:t>
+      </w:r>
+    </w:p>
+    <w:p>
+      <w:pPr>
+        <w:pStyle w:val="ListBullet"/>
+      </w:pPr>
+      <w:r>
+        <w:rPr/>
+        <w:t>Temporarily removed PII/amount masking from the Python Gemini fallback and replaced placeholder extraction with a numeric response schema. The prompt now explicitly separates transaction amount from balance, fees, cashback, limits, references and account numbers, and rejects incomplete statuses. No migration, deployment, Apps Script paste or production state change was made.</w:t>
+      </w:r>
+    </w:p>
+    <w:p>
+      <w:pPr>
+        <w:pStyle w:val="Heading3"/>
+      </w:pPr>
+      <w:r>
+        <w:rPr>
+          <w:b/>
+          <w:sz w:val="23"/>
+        </w:rPr>
+        <w:t>2026-09-04 — Python parse → encrypted staging bridge (not deployed)</w:t>
+      </w:r>
+    </w:p>
+    <w:p>
+      <w:pPr>
+        <w:pStyle w:val="ListBullet"/>
+      </w:pPr>
+      <w:r>
+        <w:rPr/>
+        <w:t>Gmail ingest now carries mailbox email, original sender and authoritative bank/wallet kind through Pub/Sub. The parser's typed reading now includes currency/FX, transaction meaning, status, account kind and reconciled flow.</w:t>
+      </w:r>
+    </w:p>
+    <w:p>
+      <w:pPr>
+        <w:pStyle w:val="ListBullet"/>
+      </w:pPr>
+      <w:r>
+        <w:rPr/>
+        <w:t xml:space="preserve">Added the optional HTTPS persistence adapter. It sends only validated reads to </w:t>
+      </w:r>
+      <w:r>
+        <w:rPr>
+          <w:rFonts w:ascii="Consolas" w:hAnsi="Consolas"/>
+          <w:b w:val="0"/>
+          <w:color w:val="2A4A3A"/>
+          <w:sz w:val="20"/>
+        </w:rPr>
+        <w:t>/mailbox-sync/ingest</w:t>
+      </w:r>
+      <w:r>
+        <w:rPr/>
+        <w:t>; missing configuration preserves parse-only mode, while partial configuration and transient HTTP failures trigger redelivery.</w:t>
+      </w:r>
+    </w:p>
+    <w:p>
+      <w:pPr>
+        <w:pStyle w:val="ListBullet"/>
+      </w:pPr>
+      <w:r>
+        <w:rPr/>
+        <w:t>Kept encryption, key handling, dedup HMAC and database inserts exclusively in the existing Edge seam. Explicit failed, declined, cancelled and pending statuses are rejected before staging. No migration, deployment or production state change was made.</w:t>
       </w:r>
     </w:p>
     <w:p>

</xml_diff>

<commit_message>
One Gmail, more than one reader (0137, 0138)
0103 banned a second account from reading a mailbox another account already
read, because the staged check and the gmail_message_id key were global, so
two readers raced. Scope both to the owner, ring every grant on push and
ingest (ack once any reader got through), flag a family row whose message
another member already staged, and drop the ban. 0137 + 0138 applied live;
mailbox-sync v46 carried this code, v47 still does. Dedup model documented
in docs/ARCHITECTURE.md.

Co-Authored-By: Claude Opus 5 (1M context) <noreply@anthropic.com>
</commit_message>
<xml_diff>
--- a/docs/specs/effortless-transaction-logging-spec.docx
+++ b/docs/specs/effortless-transaction-logging-spec.docx
@@ -30210,6 +30210,223 @@
           <w:sz w:val="28"/>
         </w:rPr>
         <w:t>28. Releases (newest first)</w:t>
+      </w:r>
+    </w:p>
+    <w:p>
+      <w:pPr>
+        <w:pStyle w:val="Heading3"/>
+      </w:pPr>
+      <w:r>
+        <w:rPr>
+          <w:b/>
+          <w:sz w:val="23"/>
+        </w:rPr>
+        <w:t>2026-09-15 — mailbox-sync + migrations 0137, 0138 (not deployed) — a mailbox may have more than one reader</w:t>
+      </w:r>
+    </w:p>
+    <w:p>
+      <w:pPr>
+        <w:pStyle w:val="ListBullet"/>
+      </w:pPr>
+      <w:r>
+        <w:rPr>
+          <w:b/>
+        </w:rPr>
+        <w:t>Two steps, in order:</w:t>
+      </w:r>
+      <w:r>
+        <w:rPr/>
+        <w:t xml:space="preserve"> </w:t>
+      </w:r>
+      <w:r>
+        <w:rPr>
+          <w:rFonts w:ascii="Consolas" w:hAnsi="Consolas"/>
+          <w:b w:val="0"/>
+          <w:color w:val="2A4A3A"/>
+          <w:sz w:val="20"/>
+        </w:rPr>
+        <w:t>0137</w:t>
+      </w:r>
+      <w:r>
+        <w:rPr/>
+        <w:t xml:space="preserve"> (per-reader key, owner backfill) after the worker is live; </w:t>
+      </w:r>
+      <w:r>
+        <w:rPr>
+          <w:rFonts w:ascii="Consolas" w:hAnsi="Consolas"/>
+          <w:b w:val="0"/>
+          <w:color w:val="2A4A3A"/>
+          <w:sz w:val="20"/>
+        </w:rPr>
+        <w:t>0138</w:t>
+      </w:r>
+      <w:r>
+        <w:rPr/>
+        <w:t xml:space="preserve"> (drop the one-reader index) only once that worker is confirmed. Two members of one family reading the same inbox: the later family row for a message is flagged "Có thể trùng" at staging. Push and ingest ack once any reader got through.</w:t>
+      </w:r>
+    </w:p>
+    <w:p>
+      <w:pPr>
+        <w:pStyle w:val="ListBullet"/>
+      </w:pPr>
+      <w:r>
+        <w:rPr>
+          <w:b/>
+        </w:rPr>
+        <w:t>For product:</w:t>
+      </w:r>
+      <w:r>
+        <w:rPr/>
+        <w:t xml:space="preserve"> one Gmail can be connected by more than one Earthy account (the same person with two logins, or two people sharing an inbox). Each account gets every transaction in its own queue, instead of the second connect being refused.</w:t>
+      </w:r>
+    </w:p>
+    <w:p>
+      <w:pPr>
+        <w:pStyle w:val="ListBullet"/>
+      </w:pPr>
+      <w:r>
+        <w:rPr>
+          <w:b/>
+        </w:rPr>
+        <w:t>Under the hood:</w:t>
+      </w:r>
+      <w:r>
+        <w:rPr/>
+        <w:t xml:space="preserve"> the "already staged?" lookup is scoped to the owner; push and ingest ring every grant on the address (</w:t>
+      </w:r>
+      <w:r>
+        <w:rPr>
+          <w:rFonts w:ascii="Consolas" w:hAnsi="Consolas"/>
+          <w:b w:val="0"/>
+          <w:color w:val="2A4A3A"/>
+          <w:sz w:val="20"/>
+        </w:rPr>
+        <w:t>grantsByEmail</w:t>
+      </w:r>
+      <w:r>
+        <w:rPr/>
+        <w:t xml:space="preserve">); </w:t>
+      </w:r>
+      <w:r>
+        <w:rPr>
+          <w:rFonts w:ascii="Consolas" w:hAnsi="Consolas"/>
+          <w:b w:val="0"/>
+          <w:color w:val="2A4A3A"/>
+          <w:sz w:val="20"/>
+        </w:rPr>
+        <w:t>0137</w:t>
+      </w:r>
+      <w:r>
+        <w:rPr/>
+        <w:t xml:space="preserve"> swaps the global </w:t>
+      </w:r>
+      <w:r>
+        <w:rPr>
+          <w:rFonts w:ascii="Consolas" w:hAnsi="Consolas"/>
+          <w:b w:val="0"/>
+          <w:color w:val="2A4A3A"/>
+          <w:sz w:val="20"/>
+        </w:rPr>
+        <w:t>gmail_message_id</w:t>
+      </w:r>
+      <w:r>
+        <w:rPr/>
+        <w:t xml:space="preserve"> key for </w:t>
+      </w:r>
+      <w:r>
+        <w:rPr>
+          <w:rFonts w:ascii="Consolas" w:hAnsi="Consolas"/>
+          <w:b w:val="0"/>
+          <w:color w:val="2A4A3A"/>
+          <w:sz w:val="20"/>
+        </w:rPr>
+        <w:t>(owner_user_id, gmail_message_id)</w:t>
+      </w:r>
+      <w:r>
+        <w:rPr/>
+        <w:t xml:space="preserve"> NULLS NOT DISTINCT and drops </w:t>
+      </w:r>
+      <w:r>
+        <w:rPr>
+          <w:rFonts w:ascii="Consolas" w:hAnsi="Consolas"/>
+          <w:b w:val="0"/>
+          <w:color w:val="2A4A3A"/>
+          <w:sz w:val="20"/>
+        </w:rPr>
+        <w:t>0103</w:t>
+      </w:r>
+      <w:r>
+        <w:rPr/>
+        <w:t xml:space="preserve">'s one-reader index. Deploy the worker first, then the migration. Deployed from </w:t>
+      </w:r>
+      <w:r>
+        <w:rPr>
+          <w:rFonts w:ascii="Consolas" w:hAnsi="Consolas"/>
+          <w:b w:val="0"/>
+          <w:color w:val="2A4A3A"/>
+          <w:sz w:val="20"/>
+        </w:rPr>
+        <w:t>main</w:t>
+      </w:r>
+      <w:r>
+        <w:rPr/>
+        <w:t xml:space="preserve"> minus </w:t>
+      </w:r>
+      <w:r>
+        <w:rPr>
+          <w:rFonts w:ascii="Consolas" w:hAnsi="Consolas"/>
+          <w:b w:val="0"/>
+          <w:color w:val="2A4A3A"/>
+          <w:sz w:val="20"/>
+        </w:rPr>
+        <w:t>5e0be5d</w:t>
+      </w:r>
+      <w:r>
+        <w:rPr/>
+        <w:t>, which stays excluded as in v45.</w:t>
+      </w:r>
+    </w:p>
+    <w:p>
+      <w:pPr>
+        <w:pStyle w:val="ListBullet"/>
+      </w:pPr>
+      <w:r>
+        <w:rPr>
+          <w:b/>
+        </w:rPr>
+        <w:t>Spec sections updated:</w:t>
+      </w:r>
+      <w:r>
+        <w:rPr/>
+        <w:t xml:space="preserve"> none; the model lives in </w:t>
+      </w:r>
+      <w:r>
+        <w:rPr>
+          <w:rFonts w:ascii="Consolas" w:hAnsi="Consolas"/>
+          <w:b w:val="0"/>
+          <w:color w:val="2A4A3A"/>
+          <w:sz w:val="20"/>
+        </w:rPr>
+        <w:t>docs/ARCHITECTURE.md</w:t>
+      </w:r>
+      <w:r>
+        <w:rPr/>
+        <w:t>.</w:t>
+      </w:r>
+    </w:p>
+    <w:p>
+      <w:pPr>
+        <w:pStyle w:val="ListBullet"/>
+      </w:pPr>
+      <w:r>
+        <w:rPr>
+          <w:b/>
+        </w:rPr>
+        <w:t>Watch for:</w:t>
+      </w:r>
+      <w:r>
+        <w:rPr/>
+        <w:t xml:space="preserve"> model calls double for mail neither reader has a template for; an account that starts reading an already-worked mailbox sees that history staged again.</w:t>
       </w:r>
     </w:p>
     <w:p>

</xml_diff>